<commit_message>
Import 16 verified Credly badges
- Certifications: replace inferred IBM/Meta entries with the real Credly
  badges (issuer, date, verification URL); keep 5 LinkedIn-only certs.
- Builder: resume shows the max_certs best matches for the job's
  focus_tags; CV lists every verified certification.
- Skills: SQL to strong; add NumPy/scikit-learn, visualisation, Linux and
  security evidence from badges. Profile: add Credly link.
- Regenerate the draft resume for the Indeed application.
</commit_message>
<xml_diff>
--- a/applications/2026-10_indeed-8fd1cfadbe5cbf37/Yisak_Metaferiya_Resume.docx
+++ b/applications/2026-10_indeed-8fd1cfadbe5cbf37/Yisak_Metaferiya_Resume.docx
@@ -2,14 +2,15 @@
 <file path=word/document.xml><?xml version="1.0" encoding="utf-8"?>
 <w:document xmlns:w="http://schemas.openxmlformats.org/wordprocessingml/2006/main" xmlns:m="http://schemas.openxmlformats.org/officeDocument/2006/math" xmlns:r="http://schemas.openxmlformats.org/officeDocument/2006/relationships" xmlns:o="urn:schemas-microsoft-com:office:office" xmlns:v="urn:schemas-microsoft-com:vml" xmlns:w10="urn:schemas-microsoft-com:office:word" xmlns:a="http://schemas.openxmlformats.org/drawingml/2006/main" xmlns:pic="http://schemas.openxmlformats.org/drawingml/2006/picture" xmlns:wp="http://schemas.openxmlformats.org/drawingml/2006/wordprocessingDrawing">
   <w:body>
-    <w:bookmarkStart w:id="42" w:name="yisak-metaferiya"/>
     <w:p>
       <w:pPr>
         <w:pStyle w:val="Heading1"/>
       </w:pPr>
+      <w:bookmarkStart w:id="20" w:name="yisak-metaferiya"/>
       <w:r>
         <w:t xml:space="preserve">Yisak Metaferiya</w:t>
       </w:r>
+      <w:bookmarkEnd w:id="20"/>
     </w:p>
     <w:p>
       <w:pPr>
@@ -17,7 +18,6 @@
       </w:pPr>
       <w:r>
         <w:rPr>
-          <w:bCs/>
           <w:b/>
         </w:rPr>
         <w:t xml:space="preserve">Junior Software Engineer | Backend Developer (Java · Spring Boot · Node.js)</w:t>
@@ -33,7 +33,7 @@
       <w:r>
         <w:t xml:space="preserve"> </w:t>
       </w:r>
-      <w:hyperlink r:id="rId20">
+      <w:hyperlink r:id="rId21">
         <w:r>
           <w:rPr>
             <w:rStyle w:val="Hyperlink"/>
@@ -50,7 +50,7 @@
       <w:r>
         <w:t xml:space="preserve"> </w:t>
       </w:r>
-      <w:hyperlink r:id="rId21">
+      <w:hyperlink r:id="rId22">
         <w:r>
           <w:rPr>
             <w:rStyle w:val="Hyperlink"/>
@@ -67,7 +67,7 @@
       <w:r>
         <w:t xml:space="preserve"> </w:t>
       </w:r>
-      <w:hyperlink r:id="rId22">
+      <w:hyperlink r:id="rId23">
         <w:r>
           <w:rPr>
             <w:rStyle w:val="Hyperlink"/>
@@ -75,15 +75,33 @@
           <w:t xml:space="preserve">Portfolio</w:t>
         </w:r>
       </w:hyperlink>
-    </w:p>
-    <w:bookmarkStart w:id="23" w:name="summary"/>
+      <w:r>
+        <w:t xml:space="preserve"> </w:t>
+      </w:r>
+      <w:r>
+        <w:t xml:space="preserve">·</w:t>
+      </w:r>
+      <w:r>
+        <w:t xml:space="preserve"> </w:t>
+      </w:r>
+      <w:hyperlink r:id="rId24">
+        <w:r>
+          <w:rPr>
+            <w:rStyle w:val="Hyperlink"/>
+          </w:rPr>
+          <w:t xml:space="preserve">Credly</w:t>
+        </w:r>
+      </w:hyperlink>
+    </w:p>
     <w:p>
       <w:pPr>
         <w:pStyle w:val="Heading2"/>
       </w:pPr>
+      <w:bookmarkStart w:id="25" w:name="summary"/>
       <w:r>
         <w:t xml:space="preserve">Summary</w:t>
       </w:r>
+      <w:bookmarkEnd w:id="25"/>
     </w:p>
     <w:p>
       <w:pPr>
@@ -93,15 +111,15 @@
         <w:t xml:space="preserve">Backend-focused software engineering student (Abu Dhabi University) and software engineering intern at nanoVOLTZ. Builds secure REST APIs in Java/Spring Boot (Spring Security, JWT, JPA, PostgreSQL), Node.js/NestJS (MongoDB, RBAC, Swagger) and Python/Flask (SQLAlchemy, Celery, Redis). Has implemented concurrency control for high-contention ticket sales, real-time updates over Server-Sent Events, and an encrypted multi-broker RabbitMQ pub/sub system. Ships with Docker and Git.</w:t>
       </w:r>
     </w:p>
-    <w:bookmarkEnd w:id="23"/>
-    <w:bookmarkStart w:id="24" w:name="technical-skills"/>
     <w:p>
       <w:pPr>
         <w:pStyle w:val="Heading2"/>
       </w:pPr>
+      <w:bookmarkStart w:id="26" w:name="technical-skills"/>
       <w:r>
         <w:t xml:space="preserve">Technical Skills</w:t>
       </w:r>
+      <w:bookmarkEnd w:id="26"/>
     </w:p>
     <w:p>
       <w:pPr>
@@ -113,7 +131,6 @@
       </w:pPr>
       <w:r>
         <w:rPr>
-          <w:bCs/>
           <w:b/>
         </w:rPr>
         <w:t xml:space="preserve">Languages:</w:t>
@@ -135,7 +152,6 @@
       </w:pPr>
       <w:r>
         <w:rPr>
-          <w:bCs/>
           <w:b/>
         </w:rPr>
         <w:t xml:space="preserve">Backend:</w:t>
@@ -157,7 +173,6 @@
       </w:pPr>
       <w:r>
         <w:rPr>
-          <w:bCs/>
           <w:b/>
         </w:rPr>
         <w:t xml:space="preserve">Databases &amp; Data:</w:t>
@@ -166,7 +181,7 @@
         <w:t xml:space="preserve"> </w:t>
       </w:r>
       <w:r>
-        <w:t xml:space="preserve">PostgreSQL, MySQL, MongoDB / Mongoose, Firebase / Firestore, Redis, SQLAlchemy / Alembic, pandas / Jupyter</w:t>
+        <w:t xml:space="preserve">PostgreSQL, MySQL, MongoDB / Mongoose, Firebase / Firestore, Redis, SQLAlchemy / Alembic, pandas / NumPy / Jupyter, scikit-learn (ML models)</w:t>
       </w:r>
     </w:p>
     <w:p>
@@ -179,7 +194,6 @@
       </w:pPr>
       <w:r>
         <w:rPr>
-          <w:bCs/>
           <w:b/>
         </w:rPr>
         <w:t xml:space="preserve">DevOps &amp; Tools:</w:t>
@@ -201,7 +215,6 @@
       </w:pPr>
       <w:r>
         <w:rPr>
-          <w:bCs/>
           <w:b/>
         </w:rPr>
         <w:t xml:space="preserve">Testing &amp; Quality:</w:t>
@@ -213,24 +226,25 @@
         <w:t xml:space="preserve">pytest, JUnit 5</w:t>
       </w:r>
     </w:p>
-    <w:bookmarkEnd w:id="24"/>
-    <w:bookmarkStart w:id="29" w:name="experience"/>
     <w:p>
       <w:pPr>
         <w:pStyle w:val="Heading2"/>
       </w:pPr>
+      <w:bookmarkStart w:id="27" w:name="experience"/>
       <w:r>
         <w:t xml:space="preserve">Experience</w:t>
       </w:r>
-    </w:p>
-    <w:bookmarkStart w:id="25" w:name="software-engineering-intern-nanovoltz"/>
+      <w:bookmarkEnd w:id="27"/>
+    </w:p>
     <w:p>
       <w:pPr>
         <w:pStyle w:val="Heading3"/>
       </w:pPr>
+      <w:bookmarkStart w:id="28" w:name="software-engineering-intern-nanovoltz"/>
       <w:r>
         <w:t xml:space="preserve">Software Engineering Intern — nanoVOLTZ</w:t>
       </w:r>
+      <w:bookmarkEnd w:id="28"/>
     </w:p>
     <w:p>
       <w:pPr>
@@ -238,21 +252,20 @@
       </w:pPr>
       <w:r>
         <w:rPr>
-          <w:iCs/>
           <w:i/>
         </w:rPr>
         <w:t xml:space="preserve">Internship · United Arab Emirates · Jan 2026 – Present</w:t>
       </w:r>
     </w:p>
-    <w:bookmarkEnd w:id="25"/>
-    <w:bookmarkStart w:id="26" w:name="project-intern-codsoft"/>
     <w:p>
       <w:pPr>
         <w:pStyle w:val="Heading3"/>
       </w:pPr>
+      <w:bookmarkStart w:id="29" w:name="project-intern-codsoft"/>
       <w:r>
         <w:t xml:space="preserve">Project Intern — CodSoft</w:t>
       </w:r>
+      <w:bookmarkEnd w:id="29"/>
     </w:p>
     <w:p>
       <w:pPr>
@@ -260,21 +273,20 @@
       </w:pPr>
       <w:r>
         <w:rPr>
-          <w:iCs/>
           <w:i/>
         </w:rPr>
         <w:t xml:space="preserve">Internship · United Arab Emirates (remote) · Dec 2024 – Jan 2025</w:t>
       </w:r>
     </w:p>
-    <w:bookmarkEnd w:id="26"/>
-    <w:bookmarkStart w:id="27" w:name="project-intern-codealpha"/>
     <w:p>
       <w:pPr>
         <w:pStyle w:val="Heading3"/>
       </w:pPr>
+      <w:bookmarkStart w:id="30" w:name="project-intern-codealpha"/>
       <w:r>
         <w:t xml:space="preserve">Project Intern — CodeAlpha</w:t>
       </w:r>
+      <w:bookmarkEnd w:id="30"/>
     </w:p>
     <w:p>
       <w:pPr>
@@ -282,21 +294,20 @@
       </w:pPr>
       <w:r>
         <w:rPr>
-          <w:iCs/>
           <w:i/>
         </w:rPr>
         <w:t xml:space="preserve">Internship · Remote · Dec 2024 – Jan 2025</w:t>
       </w:r>
     </w:p>
-    <w:bookmarkEnd w:id="27"/>
-    <w:bookmarkStart w:id="28" w:name="peer-tutor-abu-dhabi-university"/>
     <w:p>
       <w:pPr>
         <w:pStyle w:val="Heading3"/>
       </w:pPr>
+      <w:bookmarkStart w:id="31" w:name="peer-tutor-abu-dhabi-university"/>
       <w:r>
         <w:t xml:space="preserve">Peer Tutor — Abu Dhabi University</w:t>
       </w:r>
+      <w:bookmarkEnd w:id="31"/>
     </w:p>
     <w:p>
       <w:pPr>
@@ -304,29 +315,27 @@
       </w:pPr>
       <w:r>
         <w:rPr>
-          <w:iCs/>
           <w:i/>
         </w:rPr>
         <w:t xml:space="preserve">Part-time · Abu Dhabi, UAE · Feb 2024 – Jan 2025</w:t>
       </w:r>
     </w:p>
-    <w:bookmarkEnd w:id="28"/>
-    <w:bookmarkEnd w:id="29"/>
-    <w:bookmarkStart w:id="38" w:name="projects"/>
     <w:p>
       <w:pPr>
         <w:pStyle w:val="Heading2"/>
       </w:pPr>
+      <w:bookmarkStart w:id="32" w:name="projects"/>
       <w:r>
         <w:t xml:space="preserve">Projects</w:t>
       </w:r>
-    </w:p>
-    <w:bookmarkStart w:id="31" w:name="Xf71184f460edb5692e30cb6e07ef3c5147dfd93"/>
+      <w:bookmarkEnd w:id="32"/>
+    </w:p>
     <w:p>
       <w:pPr>
         <w:pStyle w:val="Heading3"/>
       </w:pPr>
-      <w:hyperlink r:id="rId30">
+      <w:bookmarkStart w:id="34" w:name="Xf71184f460edb5692e30cb6e07ef3c5147dfd93"/>
+      <w:hyperlink r:id="rId33">
         <w:r>
           <w:rPr>
             <w:rStyle w:val="Hyperlink"/>
@@ -334,6 +343,7 @@
           <w:t xml:space="preserve">MegaSeller — Concurrent Cinema Ticketing API</w:t>
         </w:r>
       </w:hyperlink>
+      <w:bookmarkEnd w:id="34"/>
     </w:p>
     <w:p>
       <w:pPr>
@@ -341,7 +351,6 @@
       </w:pPr>
       <w:r>
         <w:rPr>
-          <w:iCs/>
           <w:i/>
         </w:rPr>
         <w:t xml:space="preserve">Java 21, Spring Boot, Spring Security, JWT, Spring Data JPA, PostgreSQL, H2, Server-Sent Events</w:t>
@@ -401,13 +410,12 @@
         <w:t xml:space="preserve">Secured endpoints with Spring Security and stateless JWT authentication, separate user and admin roles, and a token filter for SSE streams.</w:t>
       </w:r>
     </w:p>
-    <w:bookmarkEnd w:id="31"/>
-    <w:bookmarkStart w:id="33" w:name="X915d69e6fc15e32859ddded87730b61669aecd7"/>
     <w:p>
       <w:pPr>
         <w:pStyle w:val="Heading3"/>
       </w:pPr>
-      <w:hyperlink r:id="rId32">
+      <w:bookmarkStart w:id="36" w:name="X915d69e6fc15e32859ddded87730b61669aecd7"/>
+      <w:hyperlink r:id="rId35">
         <w:r>
           <w:rPr>
             <w:rStyle w:val="Hyperlink"/>
@@ -415,6 +423,7 @@
           <w:t xml:space="preserve">Spring Boot API Starters — JWT Auth &amp; RBAC Templates</w:t>
         </w:r>
       </w:hyperlink>
+      <w:bookmarkEnd w:id="36"/>
     </w:p>
     <w:p>
       <w:pPr>
@@ -422,7 +431,6 @@
       </w:pPr>
       <w:r>
         <w:rPr>
-          <w:iCs/>
           <w:i/>
         </w:rPr>
         <w:t xml:space="preserve">Java, Spring Boot, Spring Security, JWT (jjwt), Spring Data JPA, MySQL, H2, Lombok</w:t>
@@ -458,13 +466,12 @@
         <w:t xml:space="preserve">Configured Spring Data JPA persistence for MySQL (production) and H2 (local/testing) with Actuator health endpoints.</w:t>
       </w:r>
     </w:p>
-    <w:bookmarkEnd w:id="33"/>
-    <w:bookmarkStart w:id="35" w:name="X4539d541f6819f2a5e42b0b43b75a3b99877b9e"/>
     <w:p>
       <w:pPr>
         <w:pStyle w:val="Heading3"/>
       </w:pPr>
-      <w:hyperlink r:id="rId34">
+      <w:bookmarkStart w:id="38" w:name="X4539d541f6819f2a5e42b0b43b75a3b99877b9e"/>
+      <w:hyperlink r:id="rId37">
         <w:r>
           <w:rPr>
             <w:rStyle w:val="Hyperlink"/>
@@ -472,6 +479,7 @@
           <w:t xml:space="preserve">Smart City Event Bus — Secure Multi-Broker Pub/Sub</w:t>
         </w:r>
       </w:hyperlink>
+      <w:bookmarkEnd w:id="38"/>
     </w:p>
     <w:p>
       <w:pPr>
@@ -479,7 +487,6 @@
       </w:pPr>
       <w:r>
         <w:rPr>
-          <w:iCs/>
           <w:i/>
         </w:rPr>
         <w:t xml:space="preserve">Java, RabbitMQ (AMQP), Topic exchanges, AES, HMAC, Maven, SLF4J</w:t>
@@ -527,13 +534,12 @@
         <w:t xml:space="preserve">Protected messages end to end with AES encryption for confidentiality and an HMAC for integrity verification at subscribers.</w:t>
       </w:r>
     </w:p>
-    <w:bookmarkEnd w:id="35"/>
-    <w:bookmarkStart w:id="37" w:name="Xb41b84ff223a6785e02af941ae9059569a53633"/>
     <w:p>
       <w:pPr>
         <w:pStyle w:val="Heading3"/>
       </w:pPr>
-      <w:hyperlink r:id="rId36">
+      <w:bookmarkStart w:id="40" w:name="Xb41b84ff223a6785e02af941ae9059569a53633"/>
+      <w:hyperlink r:id="rId39">
         <w:r>
           <w:rPr>
             <w:rStyle w:val="Hyperlink"/>
@@ -541,6 +547,7 @@
           <w:t xml:space="preserve">Makeda Threads — E-commerce Platform (NestJS + React)</w:t>
         </w:r>
       </w:hyperlink>
+      <w:bookmarkEnd w:id="40"/>
     </w:p>
     <w:p>
       <w:pPr>
@@ -548,7 +555,6 @@
       </w:pPr>
       <w:r>
         <w:rPr>
-          <w:iCs/>
           <w:i/>
         </w:rPr>
         <w:t xml:space="preserve">TypeScript, NestJS, MongoDB, Mongoose, Passport JWT, bcrypt, Swagger, Docker Compose</w:t>
@@ -596,25 +602,25 @@
         <w:t xml:space="preserve">Added order processing with notification logging, database seeding scripts and Swagger API documentation; ran services with Docker Compose.</w:t>
       </w:r>
     </w:p>
-    <w:bookmarkEnd w:id="37"/>
-    <w:bookmarkEnd w:id="38"/>
-    <w:bookmarkStart w:id="40" w:name="education"/>
     <w:p>
       <w:pPr>
         <w:pStyle w:val="Heading2"/>
       </w:pPr>
+      <w:bookmarkStart w:id="41" w:name="education"/>
       <w:r>
         <w:t xml:space="preserve">Education</w:t>
       </w:r>
-    </w:p>
-    <w:bookmarkStart w:id="39" w:name="Xec0b8bf0ba4ea88bc2b759ddd95fc1e1704ed70"/>
+      <w:bookmarkEnd w:id="41"/>
+    </w:p>
     <w:p>
       <w:pPr>
         <w:pStyle w:val="Heading3"/>
       </w:pPr>
+      <w:bookmarkStart w:id="42" w:name="Xec0b8bf0ba4ea88bc2b759ddd95fc1e1704ed70"/>
       <w:r>
         <w:t xml:space="preserve">B.Sc. Software Engineering — Abu Dhabi University</w:t>
       </w:r>
+      <w:bookmarkEnd w:id="42"/>
     </w:p>
     <w:p>
       <w:pPr>
@@ -622,7 +628,6 @@
       </w:pPr>
       <w:r>
         <w:rPr>
-          <w:iCs/>
           <w:i/>
         </w:rPr>
         <w:t xml:space="preserve">Abu Dhabi, UAE · Aug 2023 – Expected 2027</w:t>
@@ -636,16 +641,15 @@
         <w:t xml:space="preserve">Relevant coursework: Object-Oriented Programming &amp; Design Patterns (Java), Data Structures &amp; Algorithms, Operating Systems (multithreading in C), Distributed Systems (messaging, pub/sub), Web &amp; Mobile Application Development</w:t>
       </w:r>
     </w:p>
-    <w:bookmarkEnd w:id="39"/>
-    <w:bookmarkEnd w:id="40"/>
-    <w:bookmarkStart w:id="41" w:name="certifications"/>
     <w:p>
       <w:pPr>
         <w:pStyle w:val="Heading2"/>
       </w:pPr>
+      <w:bookmarkStart w:id="43" w:name="certifications"/>
       <w:r>
         <w:t xml:space="preserve">Certifications</w:t>
       </w:r>
+      <w:bookmarkEnd w:id="43"/>
     </w:p>
     <w:p>
       <w:pPr>
@@ -655,8 +659,19 @@
         </w:numPr>
         <w:pStyle w:val="Compact"/>
       </w:pPr>
-      <w:r>
-        <w:t xml:space="preserve">Visual Elements of User Interface Design — CalArts (Coursera)</w:t>
+      <w:hyperlink r:id="rId44">
+        <w:r>
+          <w:rPr>
+            <w:rStyle w:val="Hyperlink"/>
+          </w:rPr>
+          <w:t xml:space="preserve">Ethical Hacking with Kali Linux</w:t>
+        </w:r>
+      </w:hyperlink>
+      <w:r>
+        <w:t xml:space="preserve"> </w:t>
+      </w:r>
+      <w:r>
+        <w:t xml:space="preserve">— IBM (Coursera), 2026-01</w:t>
       </w:r>
     </w:p>
     <w:p>
@@ -667,8 +682,19 @@
         </w:numPr>
         <w:pStyle w:val="Compact"/>
       </w:pPr>
-      <w:r>
-        <w:t xml:space="preserve">Introduction to Next.js</w:t>
+      <w:hyperlink r:id="rId45">
+        <w:r>
+          <w:rPr>
+            <w:rStyle w:val="Hyperlink"/>
+          </w:rPr>
+          <w:t xml:space="preserve">Meta Front-End Developer Professional Certificate</w:t>
+        </w:r>
+      </w:hyperlink>
+      <w:r>
+        <w:t xml:space="preserve"> </w:t>
+      </w:r>
+      <w:r>
+        <w:t xml:space="preserve">— Meta (Coursera), 2025-10</w:t>
       </w:r>
     </w:p>
     <w:p>
@@ -679,8 +705,19 @@
         </w:numPr>
         <w:pStyle w:val="Compact"/>
       </w:pPr>
-      <w:r>
-        <w:t xml:space="preserve">Introduction to Ethical Hacking Principles</w:t>
+      <w:hyperlink r:id="rId46">
+        <w:r>
+          <w:rPr>
+            <w:rStyle w:val="Hyperlink"/>
+          </w:rPr>
+          <w:t xml:space="preserve">Querying Databases with SQL</w:t>
+        </w:r>
+      </w:hyperlink>
+      <w:r>
+        <w:t xml:space="preserve"> </w:t>
+      </w:r>
+      <w:r>
+        <w:t xml:space="preserve">— IBM (Coursera), 2025-04</w:t>
       </w:r>
     </w:p>
     <w:p>
@@ -691,8 +728,19 @@
         </w:numPr>
         <w:pStyle w:val="Compact"/>
       </w:pPr>
-      <w:r>
-        <w:t xml:space="preserve">Create a Supermarket App using Java OOP</w:t>
+      <w:hyperlink r:id="rId47">
+        <w:r>
+          <w:rPr>
+            <w:rStyle w:val="Hyperlink"/>
+          </w:rPr>
+          <w:t xml:space="preserve">Databases and SQL for Data Science</w:t>
+        </w:r>
+      </w:hyperlink>
+      <w:r>
+        <w:t xml:space="preserve"> </w:t>
+      </w:r>
+      <w:r>
+        <w:t xml:space="preserve">— IBM (Coursera), 2025-04</w:t>
       </w:r>
     </w:p>
     <w:p>
@@ -704,11 +752,9 @@
         <w:pStyle w:val="Compact"/>
       </w:pPr>
       <w:r>
-        <w:t xml:space="preserve">Python GUI Development with Tkinter</w:t>
-      </w:r>
-    </w:p>
-    <w:bookmarkEnd w:id="41"/>
-    <w:bookmarkEnd w:id="42"/>
+        <w:t xml:space="preserve">Create a Supermarket App using Java OOP</w:t>
+      </w:r>
+    </w:p>
     <w:sectPr/>
   </w:body>
 </w:document>
@@ -740,14 +786,17 @@
 <file path=word/numbering.xml><?xml version="1.0" encoding="utf-8"?>
 <w:numbering xmlns:w="http://schemas.openxmlformats.org/wordprocessingml/2006/main">
   <w:abstractNum w:abstractNumId="990">
-    <w:nsid w:val="A990"/>
+    <w:nsid w:val="2c1ae401"/>
     <w:multiLevelType w:val="multilevel"/>
     <w:lvl w:ilvl="0">
       <w:numFmt w:val="bullet"/>
       <w:lvlText w:val=" "/>
       <w:lvlJc w:val="left"/>
       <w:pPr>
-        <w:ind w:left="720" w:hanging="480"/>
+        <w:tabs>
+          <w:tab w:val="num" w:pos="0"/>
+        </w:tabs>
+        <w:ind w:left="480" w:hanging="480"/>
       </w:pPr>
     </w:lvl>
     <w:lvl w:ilvl="1">
@@ -755,7 +804,10 @@
       <w:lvlText w:val=" "/>
       <w:lvlJc w:val="left"/>
       <w:pPr>
-        <w:ind w:left="1440" w:hanging="480"/>
+        <w:tabs>
+          <w:tab w:val="num" w:pos="720"/>
+        </w:tabs>
+        <w:ind w:left="1200" w:hanging="480"/>
       </w:pPr>
     </w:lvl>
     <w:lvl w:ilvl="2">
@@ -763,7 +815,10 @@
       <w:lvlText w:val=" "/>
       <w:lvlJc w:val="left"/>
       <w:pPr>
-        <w:ind w:left="2160" w:hanging="480"/>
+        <w:tabs>
+          <w:tab w:val="num" w:pos="1440"/>
+        </w:tabs>
+        <w:ind w:left="1920" w:hanging="480"/>
       </w:pPr>
     </w:lvl>
     <w:lvl w:ilvl="3">
@@ -771,7 +826,10 @@
       <w:lvlText w:val=" "/>
       <w:lvlJc w:val="left"/>
       <w:pPr>
-        <w:ind w:left="2880" w:hanging="480"/>
+        <w:tabs>
+          <w:tab w:val="num" w:pos="2160"/>
+        </w:tabs>
+        <w:ind w:left="2640" w:hanging="480"/>
       </w:pPr>
     </w:lvl>
     <w:lvl w:ilvl="4">
@@ -779,7 +837,10 @@
       <w:lvlText w:val=" "/>
       <w:lvlJc w:val="left"/>
       <w:pPr>
-        <w:ind w:left="3600" w:hanging="480"/>
+        <w:tabs>
+          <w:tab w:val="num" w:pos="2880"/>
+        </w:tabs>
+        <w:ind w:left="3360" w:hanging="480"/>
       </w:pPr>
     </w:lvl>
     <w:lvl w:ilvl="5">
@@ -787,7 +848,10 @@
       <w:lvlText w:val=" "/>
       <w:lvlJc w:val="left"/>
       <w:pPr>
-        <w:ind w:left="4320" w:hanging="480"/>
+        <w:tabs>
+          <w:tab w:val="num" w:pos="3600"/>
+        </w:tabs>
+        <w:ind w:left="4080" w:hanging="480"/>
       </w:pPr>
     </w:lvl>
     <w:lvl w:ilvl="6">
@@ -795,7 +859,10 @@
       <w:lvlText w:val=" "/>
       <w:lvlJc w:val="left"/>
       <w:pPr>
-        <w:ind w:left="5040" w:hanging="480"/>
+        <w:tabs>
+          <w:tab w:val="num" w:pos="4320"/>
+        </w:tabs>
+        <w:ind w:left="4800" w:hanging="480"/>
       </w:pPr>
     </w:lvl>
     <w:lvl w:ilvl="7">
@@ -803,7 +870,10 @@
       <w:lvlText w:val=" "/>
       <w:lvlJc w:val="left"/>
       <w:pPr>
-        <w:ind w:left="5760" w:hanging="480"/>
+        <w:tabs>
+          <w:tab w:val="num" w:pos="5040"/>
+        </w:tabs>
+        <w:ind w:left="5520" w:hanging="480"/>
       </w:pPr>
     </w:lvl>
     <w:lvl w:ilvl="8">
@@ -811,19 +881,25 @@
       <w:lvlText w:val=" "/>
       <w:lvlJc w:val="left"/>
       <w:pPr>
-        <w:ind w:left="6480" w:hanging="480"/>
+        <w:tabs>
+          <w:tab w:val="num" w:pos="5760"/>
+        </w:tabs>
+        <w:ind w:left="6240" w:hanging="480"/>
       </w:pPr>
     </w:lvl>
   </w:abstractNum>
   <w:abstractNum w:abstractNumId="991">
-    <w:nsid w:val="A991"/>
+    <w:nsid w:val="ea454b4c"/>
     <w:multiLevelType w:val="multilevel"/>
     <w:lvl w:ilvl="0">
       <w:numFmt w:val="bullet"/>
       <w:lvlText w:val="•"/>
       <w:lvlJc w:val="left"/>
       <w:pPr>
-        <w:ind w:left="720" w:hanging="480"/>
+        <w:tabs>
+          <w:tab w:val="num" w:pos="0"/>
+        </w:tabs>
+        <w:ind w:left="480" w:hanging="480"/>
       </w:pPr>
     </w:lvl>
     <w:lvl w:ilvl="1">
@@ -831,7 +907,10 @@
       <w:lvlText w:val="–"/>
       <w:lvlJc w:val="left"/>
       <w:pPr>
-        <w:ind w:left="1440" w:hanging="480"/>
+        <w:tabs>
+          <w:tab w:val="num" w:pos="720"/>
+        </w:tabs>
+        <w:ind w:left="1200" w:hanging="480"/>
       </w:pPr>
     </w:lvl>
     <w:lvl w:ilvl="2">
@@ -839,7 +918,10 @@
       <w:lvlText w:val="•"/>
       <w:lvlJc w:val="left"/>
       <w:pPr>
-        <w:ind w:left="2160" w:hanging="480"/>
+        <w:tabs>
+          <w:tab w:val="num" w:pos="1440"/>
+        </w:tabs>
+        <w:ind w:left="1920" w:hanging="480"/>
       </w:pPr>
     </w:lvl>
     <w:lvl w:ilvl="3">
@@ -847,7 +929,10 @@
       <w:lvlText w:val="–"/>
       <w:lvlJc w:val="left"/>
       <w:pPr>
-        <w:ind w:left="2880" w:hanging="480"/>
+        <w:tabs>
+          <w:tab w:val="num" w:pos="2160"/>
+        </w:tabs>
+        <w:ind w:left="2640" w:hanging="480"/>
       </w:pPr>
     </w:lvl>
     <w:lvl w:ilvl="4">
@@ -855,7 +940,10 @@
       <w:lvlText w:val="•"/>
       <w:lvlJc w:val="left"/>
       <w:pPr>
-        <w:ind w:left="3600" w:hanging="480"/>
+        <w:tabs>
+          <w:tab w:val="num" w:pos="2880"/>
+        </w:tabs>
+        <w:ind w:left="3360" w:hanging="480"/>
       </w:pPr>
     </w:lvl>
     <w:lvl w:ilvl="5">
@@ -863,7 +951,10 @@
       <w:lvlText w:val="–"/>
       <w:lvlJc w:val="left"/>
       <w:pPr>
-        <w:ind w:left="4320" w:hanging="480"/>
+        <w:tabs>
+          <w:tab w:val="num" w:pos="3600"/>
+        </w:tabs>
+        <w:ind w:left="4080" w:hanging="480"/>
       </w:pPr>
     </w:lvl>
     <w:lvl w:ilvl="6">
@@ -871,7 +962,10 @@
       <w:lvlText w:val="•"/>
       <w:lvlJc w:val="left"/>
       <w:pPr>
-        <w:ind w:left="5040" w:hanging="480"/>
+        <w:tabs>
+          <w:tab w:val="num" w:pos="4320"/>
+        </w:tabs>
+        <w:ind w:left="4800" w:hanging="480"/>
       </w:pPr>
     </w:lvl>
     <w:lvl w:ilvl="7">
@@ -879,7 +973,10 @@
       <w:lvlText w:val="–"/>
       <w:lvlJc w:val="left"/>
       <w:pPr>
-        <w:ind w:left="5760" w:hanging="480"/>
+        <w:tabs>
+          <w:tab w:val="num" w:pos="5040"/>
+        </w:tabs>
+        <w:ind w:left="5520" w:hanging="480"/>
       </w:pPr>
     </w:lvl>
     <w:lvl w:ilvl="8">
@@ -887,7 +984,10 @@
       <w:lvlText w:val="•"/>
       <w:lvlJc w:val="left"/>
       <w:pPr>
-        <w:ind w:left="6480" w:hanging="480"/>
+        <w:tabs>
+          <w:tab w:val="num" w:pos="5760"/>
+        </w:tabs>
+        <w:ind w:left="6240" w:hanging="480"/>
       </w:pPr>
     </w:lvl>
   </w:abstractNum>
@@ -920,10 +1020,10 @@
   <w:docDefaults>
     <w:rPrDefault>
       <w:rPr>
-        <w:rFonts w:asciiTheme="minorHAnsi" w:cstheme="minorBidi" w:eastAsiaTheme="minorHAnsi" w:hAnsiTheme="minorHAnsi"/>
+        <w:rFonts w:asciiTheme="minorHAnsi" w:eastAsiaTheme="minorHAnsi" w:hAnsiTheme="minorHAnsi" w:cstheme="minorBidi"/>
         <w:sz w:val="24"/>
         <w:szCs w:val="24"/>
-        <w:lang w:bidi="ar-SA" w:eastAsia="en-US" w:val="en-US"/>
+        <w:lang w:val="en-US" w:eastAsia="en-US" w:bidi="ar-SA"/>
       </w:rPr>
     </w:rPrDefault>
     <w:pPrDefault>
@@ -932,35 +1032,35 @@
       </w:pPr>
     </w:pPrDefault>
   </w:docDefaults>
-  <w:latentStyles w:count="276" w:defLockedState="0" w:defQFormat="0" w:defSemiHidden="0" w:defUIPriority="0" w:defUnhideWhenUsed="0"/>
-  <w:style w:default="1" w:styleId="Normal" w:type="paragraph">
+  <w:latentStyles w:defLockedState="0" w:defUIPriority="0" w:defSemiHidden="0" w:defUnhideWhenUsed="0" w:defQFormat="0" w:count="276"/>
+  <w:style w:type="paragraph" w:default="1" w:styleId="Normal">
     <w:name w:val="Normal"/>
     <w:qFormat/>
   </w:style>
-  <w:style w:styleId="BodyText" w:type="paragraph">
+  <w:style w:type="paragraph" w:styleId="BodyText">
     <w:name w:val="Body Text"/>
     <w:basedOn w:val="Normal"/>
     <w:link w:val="BodyTextChar"/>
     <w:pPr>
-      <w:spacing w:after="180" w:before="180"/>
-    </w:pPr>
-    <w:qFormat/>
-  </w:style>
-  <w:style w:customStyle="1" w:styleId="FirstParagraph" w:type="paragraph">
+      <w:spacing w:before="180" w:after="180"/>
+    </w:pPr>
+    <w:qFormat/>
+  </w:style>
+  <w:style w:type="paragraph" w:customStyle="1" w:styleId="FirstParagraph">
     <w:name w:val="First Paragraph"/>
     <w:basedOn w:val="BodyText"/>
     <w:next w:val="BodyText"/>
     <w:qFormat/>
   </w:style>
-  <w:style w:customStyle="1" w:styleId="Compact" w:type="paragraph">
+  <w:style w:type="paragraph" w:customStyle="1" w:styleId="Compact">
     <w:name w:val="Compact"/>
     <w:basedOn w:val="BodyText"/>
     <w:qFormat/>
     <w:pPr>
-      <w:spacing w:after="36" w:before="36"/>
-    </w:pPr>
-  </w:style>
-  <w:style w:styleId="Title" w:type="paragraph">
+      <w:spacing w:before="36" w:after="36"/>
+    </w:pPr>
+  </w:style>
+  <w:style w:type="paragraph" w:styleId="Title">
     <w:name w:val="Title"/>
     <w:basedOn w:val="Normal"/>
     <w:next w:val="BodyText"/>
@@ -968,19 +1068,19 @@
     <w:pPr>
       <w:keepNext/>
       <w:keepLines/>
-      <w:spacing w:after="240" w:before="480"/>
+      <w:spacing w:before="480" w:after="240"/>
       <w:jc w:val="center"/>
     </w:pPr>
     <w:rPr>
-      <w:rFonts w:asciiTheme="majorHAnsi" w:cstheme="majorBidi" w:eastAsiaTheme="majorEastAsia" w:hAnsiTheme="majorHAnsi"/>
+      <w:rFonts w:asciiTheme="majorHAnsi" w:eastAsiaTheme="majorEastAsia" w:hAnsiTheme="majorHAnsi" w:cstheme="majorBidi"/>
       <w:b/>
       <w:bCs/>
-      <w:color w:themeColor="accent1" w:themeShade="B5" w:val="345A8A"/>
+      <w:color w:val="345A8A" w:themeColor="accent1" w:themeShade="B5"/>
       <w:sz w:val="36"/>
       <w:szCs w:val="36"/>
     </w:rPr>
   </w:style>
-  <w:style w:styleId="Subtitle" w:type="paragraph">
+  <w:style w:type="paragraph" w:styleId="Subtitle">
     <w:name w:val="Subtitle"/>
     <w:basedOn w:val="Title"/>
     <w:next w:val="BodyText"/>
@@ -988,7 +1088,7 @@
     <w:pPr>
       <w:keepNext/>
       <w:keepLines/>
-      <w:spacing w:after="240" w:before="240"/>
+      <w:spacing w:before="240" w:after="240"/>
       <w:jc w:val="center"/>
     </w:pPr>
     <w:rPr>
@@ -996,7 +1096,7 @@
       <w:szCs w:val="30"/>
     </w:rPr>
   </w:style>
-  <w:style w:customStyle="1" w:styleId="Author" w:type="paragraph">
+  <w:style w:type="paragraph" w:customStyle="1" w:styleId="Author">
     <w:name w:val="Author"/>
     <w:next w:val="BodyText"/>
     <w:qFormat/>
@@ -1006,7 +1106,7 @@
       <w:jc w:val="center"/>
     </w:pPr>
   </w:style>
-  <w:style w:styleId="Date" w:type="paragraph">
+  <w:style w:type="paragraph" w:styleId="Date">
     <w:name w:val="Date"/>
     <w:next w:val="BodyText"/>
     <w:qFormat/>
@@ -1016,26 +1116,7 @@
       <w:jc w:val="center"/>
     </w:pPr>
   </w:style>
-  <w:style w:customStyle="1" w:styleId="AbstractTitle" w:type="paragraph">
-    <w:name w:val="Abstract Title"/>
-    <w:basedOn w:val="Normal"/>
-    <w:next w:val="Abstract"/>
-    <w:qFormat/>
-    <w:pPr>
-      <w:keepNext/>
-      <w:keepLines/>
-      <w:jc w:val="center"/>
-      <w:spacing w:after="0" w:before="300"/>
-    </w:pPr>
-    <w:rPr>
-      <w:sz w:val="20"/>
-      <w:szCs w:val="20"/>
-      <w:b/>
-      <w:color w:val="345A8A"/>
-      &gt;
-    </w:rPr>
-  </w:style>
-  <w:style w:customStyle="1" w:styleId="Abstract" w:type="paragraph">
+  <w:style w:type="paragraph" w:customStyle="1" w:styleId="Abstract">
     <w:name w:val="Abstract"/>
     <w:basedOn w:val="Normal"/>
     <w:next w:val="BodyText"/>
@@ -1043,14 +1124,14 @@
     <w:pPr>
       <w:keepNext/>
       <w:keepLines/>
-      <w:spacing w:after="300" w:before="100"/>
+      <w:spacing w:before="300" w:after="300"/>
     </w:pPr>
     <w:rPr>
       <w:sz w:val="20"/>
       <w:szCs w:val="20"/>
     </w:rPr>
   </w:style>
-  <w:style w:styleId="Bibliography" w:type="paragraph">
+  <w:style w:type="paragraph" w:styleId="Bibliography">
     <w:name w:val="Bibliography"/>
     <w:basedOn w:val="Normal"/>
     <w:next w:val="Bibliography"/>
@@ -1058,7 +1139,7 @@
     <w:pPr/>
     <w:rPr/>
   </w:style>
-  <w:style w:styleId="Heading1" w:type="paragraph">
+  <w:style w:type="paragraph" w:styleId="Heading1">
     <w:name w:val="Heading 1"/>
     <w:basedOn w:val="Normal"/>
     <w:next w:val="BodyText"/>
@@ -1067,19 +1148,19 @@
     <w:pPr>
       <w:keepNext/>
       <w:keepLines/>
-      <w:spacing w:after="0" w:before="480"/>
+      <w:spacing w:before="480" w:after="0"/>
       <w:outlineLvl w:val="0"/>
     </w:pPr>
     <w:rPr>
-      <w:rFonts w:asciiTheme="majorHAnsi" w:cstheme="majorBidi" w:eastAsiaTheme="majorEastAsia" w:hAnsiTheme="majorHAnsi"/>
+      <w:rFonts w:asciiTheme="majorHAnsi" w:eastAsiaTheme="majorEastAsia" w:hAnsiTheme="majorHAnsi" w:cstheme="majorBidi"/>
       <w:b/>
       <w:bCs/>
-      <w:color w:themeColor="accent1" w:val="4F81BD"/>
+      <w:color w:val="4F81BD" w:themeColor="accent1"/>
       <w:sz w:val="32"/>
       <w:szCs w:val="32"/>
     </w:rPr>
   </w:style>
-  <w:style w:styleId="Heading2" w:type="paragraph">
+  <w:style w:type="paragraph" w:styleId="Heading2">
     <w:name w:val="Heading 2"/>
     <w:basedOn w:val="Normal"/>
     <w:next w:val="BodyText"/>
@@ -1089,19 +1170,19 @@
     <w:pPr>
       <w:keepNext/>
       <w:keepLines/>
-      <w:spacing w:after="0" w:before="200"/>
+      <w:spacing w:before="200" w:after="0"/>
       <w:outlineLvl w:val="1"/>
     </w:pPr>
     <w:rPr>
-      <w:rFonts w:asciiTheme="majorHAnsi" w:cstheme="majorBidi" w:eastAsiaTheme="majorEastAsia" w:hAnsiTheme="majorHAnsi"/>
+      <w:rFonts w:asciiTheme="majorHAnsi" w:eastAsiaTheme="majorEastAsia" w:hAnsiTheme="majorHAnsi" w:cstheme="majorBidi"/>
       <w:b/>
       <w:bCs/>
-      <w:color w:themeColor="accent1" w:val="4F81BD"/>
+      <w:color w:val="4F81BD" w:themeColor="accent1"/>
       <w:sz w:val="28"/>
       <w:szCs w:val="28"/>
     </w:rPr>
   </w:style>
-  <w:style w:styleId="Heading3" w:type="paragraph">
+  <w:style w:type="paragraph" w:styleId="Heading3">
     <w:name w:val="Heading 3"/>
     <w:basedOn w:val="Normal"/>
     <w:next w:val="BodyText"/>
@@ -1111,19 +1192,19 @@
     <w:pPr>
       <w:keepNext/>
       <w:keepLines/>
-      <w:spacing w:after="0" w:before="200"/>
+      <w:spacing w:before="200" w:after="0"/>
       <w:outlineLvl w:val="2"/>
     </w:pPr>
     <w:rPr>
-      <w:rFonts w:asciiTheme="majorHAnsi" w:cstheme="majorBidi" w:eastAsiaTheme="majorEastAsia" w:hAnsiTheme="majorHAnsi"/>
+      <w:rFonts w:asciiTheme="majorHAnsi" w:eastAsiaTheme="majorEastAsia" w:hAnsiTheme="majorHAnsi" w:cstheme="majorBidi"/>
       <w:b/>
       <w:bCs/>
-      <w:color w:themeColor="accent1" w:val="4F81BD"/>
+      <w:color w:val="4F81BD" w:themeColor="accent1"/>
       <w:sz w:val="24"/>
       <w:szCs w:val="24"/>
     </w:rPr>
   </w:style>
-  <w:style w:styleId="Heading4" w:type="paragraph">
+  <w:style w:type="paragraph" w:styleId="Heading4">
     <w:name w:val="Heading 4"/>
     <w:basedOn w:val="Normal"/>
     <w:next w:val="BodyText"/>
@@ -1133,19 +1214,19 @@
     <w:pPr>
       <w:keepNext/>
       <w:keepLines/>
-      <w:spacing w:after="0" w:before="200"/>
+      <w:spacing w:before="200" w:after="0"/>
       <w:outlineLvl w:val="3"/>
     </w:pPr>
     <w:rPr>
-      <w:rFonts w:asciiTheme="majorHAnsi" w:cstheme="majorBidi" w:eastAsiaTheme="majorEastAsia" w:hAnsiTheme="majorHAnsi"/>
+      <w:rFonts w:asciiTheme="majorHAnsi" w:eastAsiaTheme="majorEastAsia" w:hAnsiTheme="majorHAnsi" w:cstheme="majorBidi"/>
       <w:i/>
       <w:bCs/>
-      <w:color w:themeColor="accent1" w:val="4F81BD"/>
+      <w:color w:val="4F81BD" w:themeColor="accent1"/>
       <w:sz w:val="24"/>
       <w:szCs w:val="24"/>
     </w:rPr>
   </w:style>
-  <w:style w:styleId="Heading5" w:type="paragraph">
+  <w:style w:type="paragraph" w:styleId="Heading5">
     <w:name w:val="Heading 5"/>
     <w:basedOn w:val="Normal"/>
     <w:next w:val="BodyText"/>
@@ -1155,18 +1236,18 @@
     <w:pPr>
       <w:keepNext/>
       <w:keepLines/>
-      <w:spacing w:after="0" w:before="200"/>
+      <w:spacing w:before="200" w:after="0"/>
       <w:outlineLvl w:val="4"/>
     </w:pPr>
     <w:rPr>
-      <w:rFonts w:asciiTheme="majorHAnsi" w:cstheme="majorBidi" w:eastAsiaTheme="majorEastAsia" w:hAnsiTheme="majorHAnsi"/>
+      <w:rFonts w:asciiTheme="majorHAnsi" w:eastAsiaTheme="majorEastAsia" w:hAnsiTheme="majorHAnsi" w:cstheme="majorBidi"/>
       <w:iCs/>
-      <w:color w:themeColor="accent1" w:val="4F81BD"/>
+      <w:color w:val="4F81BD" w:themeColor="accent1"/>
       <w:sz w:val="24"/>
       <w:szCs w:val="24"/>
     </w:rPr>
   </w:style>
-  <w:style w:styleId="Heading6" w:type="paragraph">
+  <w:style w:type="paragraph" w:styleId="Heading6">
     <w:name w:val="Heading 6"/>
     <w:basedOn w:val="Normal"/>
     <w:next w:val="BodyText"/>
@@ -1176,17 +1257,17 @@
     <w:pPr>
       <w:keepNext/>
       <w:keepLines/>
-      <w:spacing w:after="0" w:before="200"/>
+      <w:spacing w:before="200" w:after="0"/>
       <w:outlineLvl w:val="5"/>
     </w:pPr>
     <w:rPr>
-      <w:rFonts w:asciiTheme="majorHAnsi" w:cstheme="majorBidi" w:eastAsiaTheme="majorEastAsia" w:hAnsiTheme="majorHAnsi"/>
-      <w:color w:themeColor="accent1" w:val="4F81BD"/>
+      <w:rFonts w:asciiTheme="majorHAnsi" w:eastAsiaTheme="majorEastAsia" w:hAnsiTheme="majorHAnsi" w:cstheme="majorBidi"/>
+      <w:color w:val="4F81BD" w:themeColor="accent1"/>
       <w:sz w:val="24"/>
       <w:szCs w:val="24"/>
     </w:rPr>
   </w:style>
-  <w:style w:styleId="Heading7" w:type="paragraph">
+  <w:style w:type="paragraph" w:styleId="Heading7">
     <w:name w:val="Heading 7"/>
     <w:basedOn w:val="Normal"/>
     <w:next w:val="BodyText"/>
@@ -1196,17 +1277,17 @@
     <w:pPr>
       <w:keepNext/>
       <w:keepLines/>
-      <w:spacing w:after="0" w:before="200"/>
+      <w:spacing w:before="200" w:after="0"/>
       <w:outlineLvl w:val="6"/>
     </w:pPr>
     <w:rPr>
-      <w:rFonts w:asciiTheme="majorHAnsi" w:cstheme="majorBidi" w:eastAsiaTheme="majorEastAsia" w:hAnsiTheme="majorHAnsi"/>
-      <w:color w:themeColor="accent1" w:val="4F81BD"/>
+      <w:rFonts w:asciiTheme="majorHAnsi" w:eastAsiaTheme="majorEastAsia" w:hAnsiTheme="majorHAnsi" w:cstheme="majorBidi"/>
+      <w:color w:val="4F81BD" w:themeColor="accent1"/>
       <w:sz w:val="24"/>
       <w:szCs w:val="24"/>
     </w:rPr>
   </w:style>
-  <w:style w:styleId="Heading8" w:type="paragraph">
+  <w:style w:type="paragraph" w:styleId="Heading8">
     <w:name w:val="Heading 8"/>
     <w:basedOn w:val="Normal"/>
     <w:next w:val="BodyText"/>
@@ -1216,17 +1297,17 @@
     <w:pPr>
       <w:keepNext/>
       <w:keepLines/>
-      <w:spacing w:after="0" w:before="200"/>
+      <w:spacing w:before="200" w:after="0"/>
       <w:outlineLvl w:val="7"/>
     </w:pPr>
     <w:rPr>
-      <w:rFonts w:asciiTheme="majorHAnsi" w:cstheme="majorBidi" w:eastAsiaTheme="majorEastAsia" w:hAnsiTheme="majorHAnsi"/>
-      <w:color w:themeColor="accent1" w:val="4F81BD"/>
+      <w:rFonts w:asciiTheme="majorHAnsi" w:eastAsiaTheme="majorEastAsia" w:hAnsiTheme="majorHAnsi" w:cstheme="majorBidi"/>
+      <w:color w:val="4F81BD" w:themeColor="accent1"/>
       <w:sz w:val="24"/>
       <w:szCs w:val="24"/>
     </w:rPr>
   </w:style>
-  <w:style w:styleId="Heading9" w:type="paragraph">
+  <w:style w:type="paragraph" w:styleId="Heading9">
     <w:name w:val="Heading 9"/>
     <w:basedOn w:val="Normal"/>
     <w:next w:val="BodyText"/>
@@ -1236,17 +1317,17 @@
     <w:pPr>
       <w:keepNext/>
       <w:keepLines/>
-      <w:spacing w:after="0" w:before="200"/>
+      <w:spacing w:before="200" w:after="0"/>
       <w:outlineLvl w:val="8"/>
     </w:pPr>
     <w:rPr>
-      <w:rFonts w:asciiTheme="majorHAnsi" w:cstheme="majorBidi" w:eastAsiaTheme="majorEastAsia" w:hAnsiTheme="majorHAnsi"/>
-      <w:color w:themeColor="accent1" w:val="4F81BD"/>
+      <w:rFonts w:asciiTheme="majorHAnsi" w:eastAsiaTheme="majorEastAsia" w:hAnsiTheme="majorHAnsi" w:cstheme="majorBidi"/>
+      <w:color w:val="4F81BD" w:themeColor="accent1"/>
       <w:sz w:val="24"/>
       <w:szCs w:val="24"/>
     </w:rPr>
   </w:style>
-  <w:style w:styleId="BlockText" w:type="paragraph">
+  <w:style w:type="paragraph" w:styleId="BlockText">
     <w:name w:val="Block Text"/>
     <w:basedOn w:val="BodyText"/>
     <w:next w:val="BodyText"/>
@@ -1254,11 +1335,11 @@
     <w:unhideWhenUsed/>
     <w:qFormat/>
     <w:pPr>
-      <w:spacing w:after="100" w:before="100"/>
+      <w:spacing w:before="100" w:after="100"/>
       <w:ind w:firstLine="0" w:left="480" w:right="480"/>
     </w:pPr>
   </w:style>
-  <w:style w:styleId="FootnoteText" w:type="paragraph">
+  <w:style w:type="paragraph" w:styleId="FootnoteText">
     <w:name w:val="Footnote Text"/>
     <w:basedOn w:val="Normal"/>
     <w:next w:val="FootnoteText"/>
@@ -1266,43 +1347,28 @@
     <w:unhideWhenUsed/>
     <w:qFormat/>
   </w:style>
-  <w:style w:default="1" w:styleId="DefaultParagraphFont" w:type="character">
+  <w:style w:type="character" w:default="1" w:styleId="DefaultParagraphFont">
     <w:name w:val="Default Paragraph Font"/>
     <w:semiHidden/>
     <w:unhideWhenUsed/>
   </w:style>
-  <w:style w:default="1" w:styleId="Table" w:type="table">
+  <w:style w:type="table" w:default="1" w:styleId="Table">
     <w:name w:val="Table"/>
     <w:basedOn w:val="TableNormal"/>
     <w:semiHidden/>
     <w:unhideWhenUsed/>
     <w:qFormat/>
     <w:tblPr>
-      <w:tblInd w:type="dxa" w:w="0"/>
+      <w:tblInd w:w="0" w:type="dxa"/>
       <w:tblCellMar>
-        <w:top w:type="dxa" w:w="0"/>
-        <w:left w:type="dxa" w:w="108"/>
-        <w:bottom w:type="dxa" w:w="0"/>
-        <w:right w:type="dxa" w:w="108"/>
+        <w:top w:w="0" w:type="dxa"/>
+        <w:left w:w="108" w:type="dxa"/>
+        <w:bottom w:w="0" w:type="dxa"/>
+        <w:right w:w="108" w:type="dxa"/>
       </w:tblCellMar>
     </w:tblPr>
-    <w:tblStylePr w:type="firstRow">
-      <w:tblPr>
-        <w:jc w:val="left"/>
-        <w:tblInd w:type="dxa" w:w="0"/>
-      </w:tblPr>
-      <w:trPr>
-        <w:jc w:val="left"/>
-      </w:trPr>
-      <w:tcPr>
-        <w:vAlign w:val="bottom"/>
-        <w:tcBorders>
-          <w:bottom w:val="single"/>
-        </w:tcBorders>
-      </w:tcPr>
-    </w:tblStylePr>
-  </w:style>
-  <w:style w:customStyle="1" w:styleId="DefinitionTerm" w:type="paragraph">
+  </w:style>
+  <w:style w:type="paragraph" w:customStyle="1" w:styleId="DefinitionTerm">
     <w:name w:val="Definition Term"/>
     <w:basedOn w:val="Normal"/>
     <w:next w:val="Definition"/>
@@ -1315,49 +1381,49 @@
       <w:b/>
     </w:rPr>
   </w:style>
-  <w:style w:customStyle="1" w:styleId="Definition" w:type="paragraph">
+  <w:style w:type="paragraph" w:customStyle="1" w:styleId="Definition">
     <w:name w:val="Definition"/>
     <w:basedOn w:val="Normal"/>
   </w:style>
-  <w:style w:styleId="Caption" w:type="paragraph">
+  <w:style w:type="paragraph" w:styleId="Caption">
     <w:name w:val="Caption"/>
     <w:basedOn w:val="Normal"/>
     <w:link w:val="BodyTextChar"/>
     <w:pPr>
-      <w:spacing w:after="120" w:before="0"/>
+      <w:spacing w:before="0" w:after="120"/>
     </w:pPr>
     <w:rPr>
       <w:i/>
     </w:rPr>
   </w:style>
-  <w:style w:customStyle="1" w:styleId="TableCaption" w:type="paragraph">
+  <w:style w:type="paragraph" w:customStyle="1" w:styleId="TableCaption">
     <w:name w:val="Table Caption"/>
     <w:basedOn w:val="Caption"/>
     <w:pPr>
       <w:keepNext/>
     </w:pPr>
   </w:style>
-  <w:style w:customStyle="1" w:styleId="ImageCaption" w:type="paragraph">
+  <w:style w:type="paragraph" w:customStyle="1" w:styleId="ImageCaption">
     <w:name w:val="Image Caption"/>
     <w:basedOn w:val="Caption"/>
   </w:style>
-  <w:style w:customStyle="1" w:styleId="Figure" w:type="paragraph">
+  <w:style w:type="paragraph" w:customStyle="1" w:styleId="Figure">
     <w:name w:val="Figure"/>
     <w:basedOn w:val="Normal"/>
   </w:style>
-  <w:style w:customStyle="1" w:styleId="CaptionedFigure" w:type="paragraph">
+  <w:style w:type="paragraph" w:customStyle="1" w:styleId="CaptionedFigure">
     <w:name w:val="Captioned Figure"/>
     <w:basedOn w:val="Figure"/>
     <w:pPr>
       <w:keepNext/>
     </w:pPr>
   </w:style>
-  <w:style w:customStyle="1" w:styleId="BodyTextChar" w:type="character">
+  <w:style w:type="character" w:customStyle="1" w:styleId="BodyTextChar">
     <w:name w:val="Body Text Char"/>
     <w:basedOn w:val="DefaultParagraphFont"/>
     <w:link w:val="BodyText"/>
   </w:style>
-  <w:style w:customStyle="1" w:styleId="VerbatimChar" w:type="character">
+  <w:style w:type="character" w:customStyle="1" w:styleId="VerbatimChar">
     <w:name w:val="Verbatim Char"/>
     <w:basedOn w:val="BodyTextChar"/>
     <w:rPr>
@@ -1365,25 +1431,21 @@
       <w:sz w:val="22"/>
     </w:rPr>
   </w:style>
-  <w:style w:customStyle="1" w:styleId="SectionNumber" w:type="character">
-    <w:name w:val="Section Number"/>
-    <w:basedOn w:val="BodyTextChar"/>
-  </w:style>
-  <w:style w:styleId="FootnoteReference" w:type="character">
+  <w:style w:type="character" w:styleId="FootnoteReference">
     <w:name w:val="Footnote Reference"/>
     <w:basedOn w:val="BodyTextChar"/>
     <w:rPr>
       <w:vertAlign w:val="superscript"/>
     </w:rPr>
   </w:style>
-  <w:style w:styleId="Hyperlink" w:type="character">
+  <w:style w:type="character" w:styleId="Hyperlink">
     <w:name w:val="Hyperlink"/>
     <w:basedOn w:val="BodyTextChar"/>
     <w:rPr>
-      <w:color w:themeColor="accent1" w:val="4F81BD"/>
-    </w:rPr>
-  </w:style>
-  <w:style w:styleId="TOCHeading" w:type="paragraph">
+      <w:color w:val="4F81BD" w:themeColor="accent1"/>
+    </w:rPr>
+  </w:style>
+  <w:style w:type="paragraph" w:styleId="TOCHeading">
     <w:name w:val="TOC Heading"/>
     <w:basedOn w:val="Heading1"/>
     <w:next w:val="BodyText"/>
@@ -1395,10 +1457,10 @@
       <w:outlineLvl w:val="9"/>
     </w:pPr>
     <w:rPr>
-      <w:rFonts w:asciiTheme="majorHAnsi" w:cstheme="majorBidi" w:eastAsiaTheme="majorEastAsia" w:hAnsiTheme="majorHAnsi"/>
+      <w:rFonts w:asciiTheme="majorHAnsi" w:eastAsiaTheme="majorEastAsia" w:hAnsiTheme="majorHAnsi" w:cstheme="majorBidi"/>
       <w:b w:val="0"/>
       <w:bCs w:val="0"/>
-      <w:color w:themeColor="accent1" w:themeShade="BF" w:val="365F91"/>
+      <w:color w:val="365F91" w:themeColor="accent1" w:themeShade="BF"/>
     </w:rPr>
   </w:style>
   <w:style w:type="paragraph" w:customStyle="1" w:styleId="SourceCode">
@@ -1490,10 +1552,7 @@
   <w:style w:type="character" w:customStyle="1" w:styleId="ImportTok">
     <w:name w:val="ImportTok"/>
     <w:basedOn w:val="VerbatimChar"/>
-    <w:rPr>
-      <w:color w:val="008000"/>
-      <w:b/>
-    </w:rPr>
+    <w:rPr/>
   </w:style>
   <w:style w:type="character" w:customStyle="1" w:styleId="CommentTok">
     <w:name w:val="CommentTok"/>
@@ -1568,9 +1627,7 @@
   <w:style w:type="character" w:customStyle="1" w:styleId="BuiltInTok">
     <w:name w:val="BuiltInTok"/>
     <w:basedOn w:val="VerbatimChar"/>
-    <w:rPr>
-      <w:color w:val="008000"/>
-    </w:rPr>
+    <w:rPr/>
   </w:style>
   <w:style w:type="character" w:customStyle="1" w:styleId="ExtensionTok">
     <w:name w:val="ExtensionTok"/>

</xml_diff>